<commit_message>
Pulir ocho expresiones del documento de meningitis V3
Aplicar las sustituciones propuestas en sus diez apariciones y ajustar las concordancias necesarias. Conservar estilos, tablas y referencias del DOCX.
</commit_message>
<xml_diff>
--- a/entregables/Meningitis_bacteriana_aguda_revisadoV3.docx
+++ b/entregables/Meningitis_bacteriana_aguda_revisadoV3.docx
@@ -105,7 +105,7 @@
           <w:sz w:val="21"/>
           <w:szCs w:val="21"/>
         </w:rPr>
-        <w:t>work</w:t>
+        <w:t>en elaboración</w:t>
       </w:r>
       <w:proofErr w:type="spellEnd"/>
       <w:r>
@@ -116,7 +116,7 @@
           <w:sz w:val="21"/>
           <w:szCs w:val="21"/>
         </w:rPr>
-        <w:t xml:space="preserve"> in </w:t>
+        <w:t xml:space="preserve"/>
       </w:r>
       <w:proofErr w:type="spellStart"/>
       <w:r>
@@ -127,7 +127,7 @@
           <w:sz w:val="21"/>
           <w:szCs w:val="21"/>
         </w:rPr>
-        <w:t>progress</w:t>
+        <w:t/>
       </w:r>
       <w:proofErr w:type="spellEnd"/>
       <w:r>
@@ -1510,10 +1510,10 @@
         <w:rPr>
           <w:b/>
         </w:rPr>
-        <w:t>sospechar con fuerza</w:t>
-      </w:r>
-      <w:r>
-        <w:t xml:space="preserve"> una MBA, aunque la sospecha fuerte también puede basarse en la valoración clínica sin la combinación completa (NICE 1.1.4‑1.1.5).</w:t>
+        <w:t>mantener una alta sospecha clínica</w:t>
+      </w:r>
+      <w:r>
+        <w:t xml:space="preserve"> de una MBA, aunque la sospecha fuerte también puede basarse en la valoración clínica sin la combinación completa (NICE 1.1.4‑1.1.5).</w:t>
       </w:r>
     </w:p>
     <w:p>
@@ -1730,7 +1730,7 @@
         <w:spacing w:after="80"/>
       </w:pPr>
       <w:r>
-        <w:t xml:space="preserve">Presentaciones atípicas que hacen perder el diagnóstico (NICE, tabla 2; SEMES 2012): en el </w:t>
+        <w:t xml:space="preserve">Presentaciones atípicas que dificultan el diagnóstico (NICE, tabla 2; SEMES 2012): en el </w:t>
       </w:r>
       <w:r>
         <w:rPr>
@@ -3111,7 +3111,7 @@
                 <w:rFonts w:ascii="Calibri" w:hAnsi="Calibri"/>
                 <w:sz w:val="21"/>
               </w:rPr>
-              <w:t xml:space="preserve">; el líquido articular puede dar el germen)</w:t>
+              <w:t xml:space="preserve">; el cultivo del líquido articular puede identificar el microorganismo)</w:t>
             </w:r>
           </w:p>
         </w:tc>
@@ -4543,7 +4543,7 @@
         <w:t>condición predisponente</w:t>
       </w:r>
       <w:r>
-        <w:t xml:space="preserve"> que pide otras pruebas</w:t>
+        <w:t xml:space="preserve"> que justifica ampliar el estudio</w:t>
       </w:r>
       <w:r>
         <w:t xml:space="preserve">: foco </w:t>
@@ -4671,7 +4671,7 @@
           <w:i/>
           <w:color w:val="C00000"/>
         </w:rPr>
-        <w:t xml:space="preserve">Una proteína C reactiva, una PCT o </w:t>
+        <w:t xml:space="preserve">Una proteína C reactiva normal, una PCT normal o </w:t>
       </w:r>
       <w:proofErr w:type="gramStart"/>
       <w:r>
@@ -4680,7 +4680,7 @@
           <w:i/>
           <w:color w:val="C00000"/>
         </w:rPr>
-        <w:t>una leucocitosis normales</w:t>
+        <w:t>un recuento leucocitario normal</w:t>
       </w:r>
       <w:proofErr w:type="gramEnd"/>
       <w:r>
@@ -7490,7 +7490,7 @@
         <w:t>Listeria es intrínsecamente resistente a las cefalosporinas.</w:t>
       </w:r>
       <w:r>
-        <w:t xml:space="preserve"> La ESCMID advierte de que en una serie holandesa el 1,5 % de los &lt;50 años sin factores de riesgo tuvo Listeria: quien quiera cubrir esa posibilidad puede añadir ampicilina a todos los adultos. La NICE no fija un corte de edad (añade amoxicilina IV si hay factores de riesgo, entre ellos la edad muy avanzada).</w:t>
+        <w:t xml:space="preserve"> La ESCMID advierte de que en una serie holandesa el 1,5 % de los &lt;50 años sin factores de riesgo tuvo Listeria: si se decide ampliar la cobertura a esa posibilidad, se puede añadir ampicilina a todos los adultos. La NICE no fija un corte de edad (añade amoxicilina IV si hay factores de riesgo, entre ellos la edad muy avanzada).</w:t>
       </w:r>
     </w:p>
     <w:p>
@@ -12070,7 +12070,7 @@
         <w:spacing w:after="80"/>
       </w:pPr>
       <w:r>
-        <w:t>Estreptococo del grupo B: la NICE propone C3G; manda la SEN 2025. La duración la da solo la NICE.</w:t>
+        <w:t>Estreptococo del grupo B: la NICE propone C3G; en esta revisión se adopta la recomendación de la SEN 2025. La duración la da solo la NICE.</w:t>
       </w:r>
     </w:p>
     <w:p>
@@ -13015,7 +13015,7 @@
         <w:rPr>
           <w:i/>
         </w:rPr>
-        <w:t>La SEMES 2012 aislaba inicialmente toda sospecha de MBA; manda la SEN 2025.</w:t>
+        <w:t>La SEMES 2012 aislaba inicialmente toda sospecha de MBA; en esta revisión se adopta la recomendación de la SEN 2025.</w:t>
       </w:r>
     </w:p>
     <w:p>
@@ -14961,7 +14961,7 @@
         <w:t>600 mg VO cada 24 h durante 4 días</w:t>
       </w:r>
       <w:r>
-        <w:t xml:space="preserve"> (dosis de la SEMES 2012). La SEMES 2012 la limitaba a los convivientes cuando en el domicilio hay niños &lt;6 años no vacunados, o cuando la persona trabaja con niños de esa edad; manda la SEN 2025, que no pone esa condición.</w:t>
+        <w:t xml:space="preserve"> (dosis de la SEMES 2012). La SEMES 2012 la limitaba a los convivientes cuando en el domicilio hay niños &lt;6 años no vacunados, o cuando la persona trabaja con niños de esa edad; en esta revisión se adopta la recomendación de la SEN 2025, que no pone esa condición.</w:t>
       </w:r>
     </w:p>
     <w:p>

</xml_diff>